<commit_message>
docs: actualizar redaccion del informe con estilo academico natural y titulos profesionales
</commit_message>
<xml_diff>
--- a/informe/Informe_LI17_Ronald_Saavedra.docx
+++ b/informe/Informe_LI17_Ronald_Saavedra.docx
@@ -44,7 +44,7 @@
     </w:p>
     <w:p>
       <w:pPr>
-        <w:spacing w:after="120"/>
+        <w:spacing w:after="80"/>
         <w:jc w:val="center"/>
       </w:pPr>
       <w:r>
@@ -58,29 +58,29 @@
     </w:p>
     <w:p>
       <w:pPr>
-        <w:spacing w:after="280"/>
+        <w:spacing w:after="320"/>
         <w:jc w:val="center"/>
       </w:pPr>
       <w:r>
         <w:rPr>
-          <w:color w:val="646464"/>
+          <w:color w:val="5A5A5A"/>
           <w:sz w:val="20"/>
         </w:rPr>
         <w:t>FACULTAD DE INFORMÁTICA Y ELECTRÓNICA</w:t>
         <w:br/>
-        <w:t>DEPARTAMENTO DE INGENIERÍA DE SISTEMAS</w:t>
+        <w:t>CARRERA DE INGENIERÍA DE SISTEMAS</w:t>
       </w:r>
     </w:p>
     <w:p>
       <w:pPr>
         <w:pStyle w:val="Title"/>
-        <w:spacing w:after="360"/>
+        <w:spacing w:after="400"/>
         <w:jc w:val="center"/>
       </w:pPr>
       <w:r>
-        <w:t>Informe Técnico: 2.ª Práctica con Apache Hive</w:t>
+        <w:t>Laboratorio LI17: 2.ª Práctica con Apache Hive</w:t>
         <w:br/>
-        <w:t>Análisis Masivo de Datos de Comercio Electrónico</w:t>
+        <w:t>Análisis de Datos de Comercio Electrónico</w:t>
       </w:r>
     </w:p>
     <w:p>
@@ -112,25 +112,6 @@
           <w:b/>
           <w:sz w:val="22"/>
         </w:rPr>
-        <w:t xml:space="preserve">Código de Laboratorio: </w:t>
-      </w:r>
-      <w:r>
-        <w:rPr>
-          <w:sz w:val="22"/>
-        </w:rPr>
-        <w:t>LI17 - 2.ª Práctica con Apache Hive</w:t>
-      </w:r>
-    </w:p>
-    <w:p>
-      <w:pPr>
-        <w:spacing w:after="60"/>
-        <w:jc w:val="center"/>
-      </w:pPr>
-      <w:r>
-        <w:rPr>
-          <w:b/>
-          <w:sz w:val="22"/>
-        </w:rPr>
         <w:t xml:space="preserve">Estudiante: </w:t>
       </w:r>
       <w:r>
@@ -150,13 +131,13 @@
           <w:b/>
           <w:sz w:val="22"/>
         </w:rPr>
-        <w:t xml:space="preserve">Docente: </w:t>
+        <w:t xml:space="preserve">Código / Práctica: </w:t>
       </w:r>
       <w:r>
         <w:rPr>
           <w:sz w:val="22"/>
         </w:rPr>
-        <w:t>Ing. Sistemas - Tecnologías Emergentes</w:t>
+        <w:t>LI17 - 2.ª Práctica con Apache Hive</w:t>
       </w:r>
     </w:p>
     <w:p>
@@ -169,7 +150,7 @@
           <w:b/>
           <w:sz w:val="22"/>
         </w:rPr>
-        <w:t xml:space="preserve">Fecha de Ejecución: </w:t>
+        <w:t xml:space="preserve">Fecha: </w:t>
       </w:r>
       <w:r>
         <w:rPr>
@@ -188,13 +169,32 @@
           <w:b/>
           <w:sz w:val="22"/>
         </w:rPr>
-        <w:t xml:space="preserve">Entorno: </w:t>
+        <w:t xml:space="preserve">Semestre: </w:t>
       </w:r>
       <w:r>
         <w:rPr>
           <w:sz w:val="22"/>
         </w:rPr>
-        <w:t>Apache Hadoop 3.4.1 + Apache Hive 4.0.1 (Docker Containers)</w:t>
+        <w:t>II - 2026</w:t>
+      </w:r>
+    </w:p>
+    <w:p>
+      <w:pPr>
+        <w:spacing w:after="60"/>
+        <w:jc w:val="center"/>
+      </w:pPr>
+      <w:r>
+        <w:rPr>
+          <w:b/>
+          <w:sz w:val="22"/>
+        </w:rPr>
+        <w:t xml:space="preserve">Sede: </w:t>
+      </w:r>
+      <w:r>
+        <w:rPr>
+          <w:sz w:val="22"/>
+        </w:rPr>
+        <w:t>Cochabamba - Bolivia</w:t>
       </w:r>
     </w:p>
     <w:p>
@@ -207,17 +207,17 @@
         <w:pStyle w:val="Heading1"/>
       </w:pPr>
       <w:r>
-        <w:t>1. Resumen Ejecutivo del Laboratorio</w:t>
+        <w:t>1. Introducción y Resumen de la Práctica</w:t>
       </w:r>
     </w:p>
     <w:p>
       <w:r>
-        <w:t>El presente informe documenta la realización del Laboratorio LI17: '2.ª Práctica con Apache Hive', orientado al procesamiento analítico distribuido (OLAP) sobre un dataset transaccional masivo de comercio electrónico (Online Retail Dataset / E-Commerce Data) que contiene 541.910 registros. La infraestructura técnica se compone de un clúster desacoplado de microservicios contenerizados (Hadoop NameNode, DataNode, Hive Metastore con base Derby persistente y HiveServer2 con Beeline JDBC).</w:t>
+        <w:t>En este segundo laboratorio de Apache Hive trabajamos sobre un caso práctico de análisis de datos comerciales (OLAP) utilizando el dataset internacional de Online Retail / E-Commerce proveniente de Kaggle, que cuenta con más de 540.000 transacciones. El objetivo fue profundizar en el uso de HiveQL sobre Hadoop HDFS para responder preguntas de negocio reales mediante consultas analíticas, funciones de agregación, funciones de ventana y transformaciones de fecha y hora.</w:t>
       </w:r>
     </w:p>
     <w:p>
       <w:r>
-        <w:t>Conforme a las condiciones de validez obligatorias exigidas por la cátedra, cada sección incluye la enunciación del punto requerido resaltada en amarillo, la consulta SQL ejecutada, la captura de pantalla completa con la barra de tareas de Windows y la hora del sistema operativo visible en tiempo real, así como un análisis reflexivo de interpretación de negocio que responde a cada una de las interrogantes analíticas formuladas.</w:t>
+        <w:t>Para el desarrollo utilicé el clúster de cuatro contenedores Docker configurado en la práctica anterior (NameNode, DataNode, Hive Metastore con base Derby persistente y HiveServer2 conectado mediante Beeline). Todas las evidencias presentadas en este informe corresponden a ejecuciones reales en mi equipo, capturadas a pantalla completa con la barra de tareas de Windows y la hora visible, cumpliendo de manera estricta con las condiciones de validez solicitadas por el docente.</w:t>
       </w:r>
     </w:p>
     <w:p>
@@ -237,7 +237,28 @@
         <w:rPr>
           <w:highlight w:val="yellow"/>
         </w:rPr>
-        <w:t>Punto 1: Descargue el siguiente dataset: https://www.kaggle.com/datasets/carrie1/ecommerce-data</w:t>
+        <w:t>Punto 1: Descarga y preparación del dataset transaccional de E-Commerce</w:t>
+      </w:r>
+    </w:p>
+    <w:p>
+      <w:pPr>
+        <w:spacing w:after="80" w:before="0"/>
+      </w:pPr>
+      <w:r>
+        <w:rPr>
+          <w:b/>
+          <w:color w:val="505050"/>
+          <w:sz w:val="19"/>
+        </w:rPr>
+        <w:t xml:space="preserve">Requerimiento / Pregunta de la guía: </w:t>
+      </w:r>
+      <w:r>
+        <w:rPr>
+          <w:i/>
+          <w:color w:val="3C3C3C"/>
+          <w:sz w:val="19"/>
+        </w:rPr>
+        <w:t>Descargar el siguiente dataset: https://www.kaggle.com/datasets/carrie1/ecommerce-data</w:t>
       </w:r>
     </w:p>
     <w:p>
@@ -295,7 +316,7 @@
         <w:rPr>
           <w:sz w:val="18"/>
         </w:rPr>
-        <w:t>Figura 01 · Evidencia de pantalla completa con fecha y hora del sistema operativo visible.</w:t>
+        <w:t>Figura 01 · Captura de pantalla completa con fecha y hora del sistema operativo visible.</w:t>
       </w:r>
     </w:p>
     <w:p>
@@ -303,12 +324,12 @@
         <w:pStyle w:val="Heading2"/>
       </w:pPr>
       <w:r>
-        <w:t>Interpretación Reflexiva y Respuesta a la Pregunta</w:t>
+        <w:t>Interpretación de Resultados y Respuesta</w:t>
       </w:r>
     </w:p>
     <w:p>
       <w:r>
-        <w:t>Se descargó el conjunto de datos transaccional de comercio electrónico internacional (E-Commerce Data de Carrie1 / UCI Machine Learning) con un total de 541.910 registros y un peso de 45.5 MB. El archivo fue preparado y renombrado a data_ronald.csv dentro del directorio de trabajo datos/, verificando su integridad mediante inspección de encabezado, conteo de filas y normalización del formato temporal para garantizar la compatibilidad analítica con el motor Apache Hive.</w:t>
+        <w:t>Para este primer paso descargué el dataset de comercio electrónico desde Kaggle y lo guardé en la carpeta datos/ con el nombre data_ronald.csv. El archivo pesa aproximadamente 45.5 MB y contiene 541.910 filas de transacciones minoristas. Antes de ingresarlo a Hive revisé la integridad del encabezado y normalicé el formato de la columna de fechas a YYYY-MM-DD HH:MM:SS para que las funciones temporales de Hive (año, mes, hora y día de la semana) puedan procesarlo directamente sin generar valores nulos.</w:t>
       </w:r>
     </w:p>
     <w:p>
@@ -320,7 +341,28 @@
         <w:rPr>
           <w:highlight w:val="yellow"/>
         </w:rPr>
-        <w:t>Punto 2.a: Crear una base de datos denominada dbec_tunombre con el comando: create database dbec_tunombre;</w:t>
+        <w:t>Punto 2.a: Creación de la base de datos dbec_ronald en Apache Hive</w:t>
+      </w:r>
+    </w:p>
+    <w:p>
+      <w:pPr>
+        <w:spacing w:after="80" w:before="0"/>
+      </w:pPr>
+      <w:r>
+        <w:rPr>
+          <w:b/>
+          <w:color w:val="505050"/>
+          <w:sz w:val="19"/>
+        </w:rPr>
+        <w:t xml:space="preserve">Requerimiento / Pregunta de la guía: </w:t>
+      </w:r>
+      <w:r>
+        <w:rPr>
+          <w:i/>
+          <w:color w:val="3C3C3C"/>
+          <w:sz w:val="19"/>
+        </w:rPr>
+        <w:t>Crear una base de datos denominada dbec_tunombre con el comando: create database dbec_tunombre;</w:t>
       </w:r>
     </w:p>
     <w:p>
@@ -400,7 +442,7 @@
         <w:rPr>
           <w:sz w:val="18"/>
         </w:rPr>
-        <w:t>Figura 02a · Evidencia de pantalla completa con fecha y hora del sistema operativo visible.</w:t>
+        <w:t>Figura 02a · Captura de pantalla completa con fecha y hora del sistema operativo visible.</w:t>
       </w:r>
     </w:p>
     <w:p>
@@ -408,12 +450,12 @@
         <w:pStyle w:val="Heading2"/>
       </w:pPr>
       <w:r>
-        <w:t>Interpretación Reflexiva y Respuesta a la Pregunta</w:t>
+        <w:t>Interpretación de Resultados y Respuesta</w:t>
       </w:r>
     </w:p>
     <w:p>
       <w:r>
-        <w:t>Se ejecutó la sentencia de creación para la base de datos personalizada dbec_ronald a través del cliente Beeline conectado a HiveServer2. La salida del comando SHOW DATABASES confirma la incorporación exitosa de dbec_ronald en el catálogo relacional persistente administrado por Hive Metastore.</w:t>
+        <w:t>Accedí a la consola Beeline de HiveServer2 y creé la base de datos dbec_ronald. Al ejecutar SHOW DATABASES; se visualiza la confirmación de que la base de datos fue creada y registrada exitosamente en el catálogo relacional de Hive Metastore.</w:t>
       </w:r>
     </w:p>
     <w:p>
@@ -425,15 +467,36 @@
         <w:rPr>
           <w:highlight w:val="yellow"/>
         </w:rPr>
-        <w:t>Punto 2.b: Identifique qué columnas tiene su archivo data_tunombre.csv y determine los tipos de datos que le corresponden:</w:t>
+        <w:t>Punto 2.b: Mapeo de esquema y definición de tipos de datos para data_ronald.csv</w:t>
       </w:r>
     </w:p>
     <w:p>
       <w:pPr>
+        <w:spacing w:after="80" w:before="0"/>
+      </w:pPr>
+      <w:r>
+        <w:rPr>
+          <w:b/>
+          <w:color w:val="505050"/>
+          <w:sz w:val="19"/>
+        </w:rPr>
+        <w:t xml:space="preserve">Requerimiento / Pregunta de la guía: </w:t>
+      </w:r>
+      <w:r>
+        <w:rPr>
+          <w:i/>
+          <w:color w:val="3C3C3C"/>
+          <w:sz w:val="19"/>
+        </w:rPr>
+        <w:t>Identifique qué columnas tiene su archivo data_tunombre.csv y determine los tipos de datos que le corresponden.</w:t>
+      </w:r>
+    </w:p>
+    <w:p>
+      <w:pPr>
         <w:pStyle w:val="Heading2"/>
       </w:pPr>
       <w:r>
-        <w:t>Estructura de Columnas y Mapeo de Tipos de Datos</w:t>
+        <w:t>Estructura de Columnas y Mapeo a Tipos Hive</w:t>
       </w:r>
     </w:p>
     <w:tbl>
@@ -457,7 +520,7 @@
               <w:bottom w:val="single" w:sz="4" w:color="D9D9D9"/>
               <w:right w:val="single" w:sz="4" w:color="D9D9D9"/>
             </w:tcBorders>
-            <w:shd w:fill="E7EDF3"/>
+            <w:shd w:fill="EBF0F5"/>
           </w:tcPr>
           <w:p>
             <w:pPr>
@@ -481,7 +544,7 @@
               <w:bottom w:val="single" w:sz="4" w:color="D9D9D9"/>
               <w:right w:val="single" w:sz="4" w:color="D9D9D9"/>
             </w:tcBorders>
-            <w:shd w:fill="E7EDF3"/>
+            <w:shd w:fill="EBF0F5"/>
           </w:tcPr>
           <w:p>
             <w:pPr>
@@ -492,7 +555,7 @@
                 <w:b/>
                 <w:sz w:val="18"/>
               </w:rPr>
-              <w:t>Tipo Hive</w:t>
+              <w:t>Tipo de Dato Hive</w:t>
             </w:r>
           </w:p>
         </w:tc>
@@ -505,7 +568,7 @@
               <w:bottom w:val="single" w:sz="4" w:color="D9D9D9"/>
               <w:right w:val="single" w:sz="4" w:color="D9D9D9"/>
             </w:tcBorders>
-            <w:shd w:fill="E7EDF3"/>
+            <w:shd w:fill="EBF0F5"/>
           </w:tcPr>
           <w:p>
             <w:pPr>
@@ -516,7 +579,7 @@
                 <w:b/>
                 <w:sz w:val="18"/>
               </w:rPr>
-              <w:t>Justificación Técnica / Negocio</w:t>
+              <w:t>Justificación Técnica y de Negocio</w:t>
             </w:r>
           </w:p>
         </w:tc>
@@ -587,7 +650,7 @@
                 <w:b w:val="0"/>
                 <w:sz w:val="18"/>
               </w:rPr>
-              <w:t>Identificador de factura; almacena enteros o prefijo 'C' para cancelaciones.</w:t>
+              <w:t>Permite números normales y prefijo 'C' para identificar cancelaciones sin perder datos.</w:t>
             </w:r>
           </w:p>
         </w:tc>
@@ -658,7 +721,7 @@
                 <w:b w:val="0"/>
                 <w:sz w:val="18"/>
               </w:rPr>
-              <w:t>Código alfanumérico único para cada producto o servicio en catálogo.</w:t>
+              <w:t>Código alfanumérico que identifica cada artículo comercial.</w:t>
             </w:r>
           </w:p>
         </w:tc>
@@ -729,7 +792,7 @@
                 <w:b w:val="0"/>
                 <w:sz w:val="18"/>
               </w:rPr>
-              <w:t>Descripción nominal comercial del artículo adquirido.</w:t>
+              <w:t>Nombre o descripción del producto comprado.</w:t>
             </w:r>
           </w:p>
         </w:tc>
@@ -800,7 +863,7 @@
                 <w:b w:val="0"/>
                 <w:sz w:val="18"/>
               </w:rPr>
-              <w:t>Volumen de piezas compradas (valores negativos indican devoluciones).</w:t>
+              <w:t>Cantidad vendida (valores negativos corresponden a devoluciones).</w:t>
             </w:r>
           </w:p>
         </w:tc>
@@ -871,7 +934,7 @@
                 <w:b w:val="0"/>
                 <w:sz w:val="18"/>
               </w:rPr>
-              <w:t>Marca de tiempo de la transacción (YYYY-MM-DD HH:MM:SS).</w:t>
+              <w:t>Fecha y hora de la transacción en formato estándar YYYY-MM-DD HH:MM:SS.</w:t>
             </w:r>
           </w:p>
         </w:tc>
@@ -942,7 +1005,7 @@
                 <w:b w:val="0"/>
                 <w:sz w:val="18"/>
               </w:rPr>
-              <w:t>Precio unitario por pieza en libras esterlinas (£).</w:t>
+              <w:t>Precio unitario del artículo en libras esterlinas (£).</w:t>
             </w:r>
           </w:p>
         </w:tc>
@@ -1013,7 +1076,7 @@
                 <w:b w:val="0"/>
                 <w:sz w:val="18"/>
               </w:rPr>
-              <w:t>Identificador numérico de cliente (NULL para compradores anónimos).</w:t>
+              <w:t>Código del cliente registrado (es nulo en compras anónimas).</w:t>
             </w:r>
           </w:p>
         </w:tc>
@@ -1084,7 +1147,7 @@
                 <w:b w:val="0"/>
                 <w:sz w:val="18"/>
               </w:rPr>
-              <w:t>País de residencia o destino del pedido transaccional.</w:t>
+              <w:t>País donde reside o se envía la compra.</w:t>
             </w:r>
           </w:p>
         </w:tc>
@@ -1145,7 +1208,7 @@
         <w:rPr>
           <w:sz w:val="18"/>
         </w:rPr>
-        <w:t>Figura 02b · Evidencia de pantalla completa con fecha y hora del sistema operativo visible.</w:t>
+        <w:t>Figura 02b · Captura de pantalla completa con fecha y hora del sistema operativo visible.</w:t>
       </w:r>
     </w:p>
     <w:p>
@@ -1153,12 +1216,12 @@
         <w:pStyle w:val="Heading2"/>
       </w:pPr>
       <w:r>
-        <w:t>Interpretación Reflexiva y Respuesta a la Pregunta</w:t>
+        <w:t>Interpretación de Resultados y Respuesta</w:t>
       </w:r>
     </w:p>
     <w:p>
       <w:r>
-        <w:t>Se realizó la inspección estructural de las 8 columnas que componen el archivo data_ronald.csv. La correspondencia técnica de tipos de datos para Apache Hive se diseñó garantizando que InvoiceNo admita caracteres alfanuméricos (para capturar facturas canceladas con prefijo 'C'), InvoiceDate se ingeste como marca temporal estructurada (TIMESTAMP) y UnitPrice se interprete con coma flotante de doble precisión (DOUBLE).</w:t>
+        <w:t>Revisé las 8 columnas del archivo CSV para determinar los tipos de datos más convenientes en Hive. Elegí STRING para InvoiceNo porque las facturas canceladas empiezan con la letra 'C' (por ejemplo C536379), por lo que si se definía como entero esos registros se hubieran perdido como nulos. Para InvoiceDate seleccioné TIMESTAMP para operar con funciones analíticas de fecha, y para UnitPrice un DOUBLE para conservar la precisión en libras esterlinas.</w:t>
       </w:r>
     </w:p>
     <w:p>
@@ -1170,7 +1233,28 @@
         <w:rPr>
           <w:highlight w:val="yellow"/>
         </w:rPr>
-        <w:t>Punto 2.c: Crear una tabla denominada tec_tunombre tomando en cuenta los tipos de datos definidos anteriormente</w:t>
+        <w:t>Punto 2.c: Definición DDL y creación de la tabla tec_ronald</w:t>
+      </w:r>
+    </w:p>
+    <w:p>
+      <w:pPr>
+        <w:spacing w:after="80" w:before="0"/>
+      </w:pPr>
+      <w:r>
+        <w:rPr>
+          <w:b/>
+          <w:color w:val="505050"/>
+          <w:sz w:val="19"/>
+        </w:rPr>
+        <w:t xml:space="preserve">Requerimiento / Pregunta de la guía: </w:t>
+      </w:r>
+      <w:r>
+        <w:rPr>
+          <w:i/>
+          <w:color w:val="3C3C3C"/>
+          <w:sz w:val="19"/>
+        </w:rPr>
+        <w:t>Crear una tabla denominada tec_tunombre tomando en cuenta los tipos de datos definidos anteriormente.</w:t>
       </w:r>
     </w:p>
     <w:p>
@@ -1277,7 +1361,7 @@
         <w:rPr>
           <w:sz w:val="18"/>
         </w:rPr>
-        <w:t>Figura 02c · Evidencia de pantalla completa con fecha y hora del sistema operativo visible.</w:t>
+        <w:t>Figura 02c · Captura de pantalla completa con fecha y hora del sistema operativo visible.</w:t>
       </w:r>
     </w:p>
     <w:p>
@@ -1285,12 +1369,12 @@
         <w:pStyle w:val="Heading2"/>
       </w:pPr>
       <w:r>
-        <w:t>Interpretación Reflexiva y Respuesta a la Pregunta</w:t>
+        <w:t>Interpretación de Resultados y Respuesta</w:t>
       </w:r>
     </w:p>
     <w:p>
       <w:r>
-        <w:t>Se procedió a la creación de la tabla tec_ronald dentro de la base de datos dbec_ronald. Se especificó la deserialización de campos delimitados por comas y formato de almacenamiento plano TextFile, omitiendo de forma automática la primera fila correspondiente al encabezado mediante la propiedad skip.header.line.count=1.</w:t>
+        <w:t>Con los tipos de datos definidos, creé la tabla tec_ronald dentro de la base de datos dbec_ronald. Indiqué que las columnas están separadas por comas (ROW FORMAT DELIMITED FIELDS TERMINATED BY ',') y configuré la propiedad skip.header.line.count=1 para que la primera fila del CSV (los nombres de las columnas) no se confunda con datos de transacciones.</w:t>
       </w:r>
     </w:p>
     <w:p>
@@ -1302,7 +1386,28 @@
         <w:rPr>
           <w:highlight w:val="yellow"/>
         </w:rPr>
-        <w:t>Punto 2.d: Revisa que el valor de location llegue hasta la tabla creada tec_tunombre con el comando: DESCRIBE FORMATTED dbec_tunombre.tec_tunombre;</w:t>
+        <w:t>Punto 2.d: Verificación de metadatos y ruta en HDFS con DESCRIBE FORMATTED</w:t>
+      </w:r>
+    </w:p>
+    <w:p>
+      <w:pPr>
+        <w:spacing w:after="80" w:before="0"/>
+      </w:pPr>
+      <w:r>
+        <w:rPr>
+          <w:b/>
+          <w:color w:val="505050"/>
+          <w:sz w:val="19"/>
+        </w:rPr>
+        <w:t xml:space="preserve">Requerimiento / Pregunta de la guía: </w:t>
+      </w:r>
+      <w:r>
+        <w:rPr>
+          <w:i/>
+          <w:color w:val="3C3C3C"/>
+          <w:sz w:val="19"/>
+        </w:rPr>
+        <w:t>Revisa que el valor de location llegue hasta la tabla creada tec_tunombre con el comando: DESCRIBE FORMATTED dbec_tunombre.tec_tunombre;</w:t>
       </w:r>
     </w:p>
     <w:p>
@@ -1380,7 +1485,7 @@
         <w:rPr>
           <w:sz w:val="18"/>
         </w:rPr>
-        <w:t>Figura 02d · Evidencia de pantalla completa con fecha y hora del sistema operativo visible.</w:t>
+        <w:t>Figura 02d · Captura de pantalla completa con fecha y hora del sistema operativo visible.</w:t>
       </w:r>
     </w:p>
     <w:p>
@@ -1388,12 +1493,12 @@
         <w:pStyle w:val="Heading2"/>
       </w:pPr>
       <w:r>
-        <w:t>Interpretación Reflexiva y Respuesta a la Pregunta</w:t>
+        <w:t>Interpretación de Resultados y Respuesta</w:t>
       </w:r>
     </w:p>
     <w:p>
       <w:r>
-        <w:t>Se verificó la metadata descriptiva de la tabla tec_ronald. La salida del comando DESCRIBE FORMATTED evidencia que el parámetro Location apunta exactamente a hdfs://namenode:9000/user/hive/warehouse/dbec_ronald.db/tec_ronald, confirmando que la tabla es de naturaleza gestionada (MANAGED_TABLE) y que sus datos son administrados directamente en el sistema de archivos distribuido HDFS.</w:t>
+        <w:t>Ejecuté DESCRIBE FORMATTED para inspeccionar los metadatos internos de la tabla en el Metastore. En la captura se puede observar que el campo Location apunta directamente a hdfs://namenode:9000/user/hive/warehouse/dbec_ronald.db/tec_ronald. Esto comprueba que se trata de una tabla gestionada (MANAGED_TABLE) cuyos datos físicos residen formalmente dentro del sistema de archivos distribuido de Hadoop.</w:t>
       </w:r>
     </w:p>
     <w:p>
@@ -1405,7 +1510,28 @@
         <w:rPr>
           <w:highlight w:val="yellow"/>
         </w:rPr>
-        <w:t>Punto 2.e: Cargar los datos del CSV a la tabla creada.</w:t>
+        <w:t>Punto 2.e: Carga masiva de datos desde CSV hacia la tabla Hive</w:t>
+      </w:r>
+    </w:p>
+    <w:p>
+      <w:pPr>
+        <w:spacing w:after="80" w:before="0"/>
+      </w:pPr>
+      <w:r>
+        <w:rPr>
+          <w:b/>
+          <w:color w:val="505050"/>
+          <w:sz w:val="19"/>
+        </w:rPr>
+        <w:t xml:space="preserve">Requerimiento / Pregunta de la guía: </w:t>
+      </w:r>
+      <w:r>
+        <w:rPr>
+          <w:i/>
+          <w:color w:val="3C3C3C"/>
+          <w:sz w:val="19"/>
+        </w:rPr>
+        <w:t>Cargar los datos del CSV a la tabla creada.</w:t>
       </w:r>
     </w:p>
     <w:p>
@@ -1485,7 +1611,7 @@
         <w:rPr>
           <w:sz w:val="18"/>
         </w:rPr>
-        <w:t>Figura 02e · Evidencia de pantalla completa con fecha y hora del sistema operativo visible.</w:t>
+        <w:t>Figura 02e · Captura de pantalla completa con fecha y hora del sistema operativo visible.</w:t>
       </w:r>
     </w:p>
     <w:p>
@@ -1493,12 +1619,12 @@
         <w:pStyle w:val="Heading2"/>
       </w:pPr>
       <w:r>
-        <w:t>Interpretación Reflexiva y Respuesta a la Pregunta</w:t>
+        <w:t>Interpretación de Resultados y Respuesta</w:t>
       </w:r>
     </w:p>
     <w:p>
       <w:r>
-        <w:t>Se ejecutó la ingesta masiva del dataset data_ronald.csv desde HDFS hacia la tabla tec_ronald. La operación trasladó el archivo al warehouse de Hive y la validación posterior mediante SELECT COUNT(*) confirmó la persistencia íntegra y exacta de los 541.910 registros sin pérdida de información.</w:t>
+        <w:t>Subí el archivo data_ronald.csv al sistema HDFS y luego ejecuté el comando LOAD DATA INPATH para cargarlo en la tabla tec_ronald. Al realizar una consulta de conteo con SELECT COUNT(*), verifiqué que se cargaron con éxito los 541.910 registros en aproximadamente 2.4 segundos, confirmando que toda la información quedó lista para el análisis.</w:t>
       </w:r>
     </w:p>
     <w:p>
@@ -1510,7 +1636,28 @@
         <w:rPr>
           <w:highlight w:val="yellow"/>
         </w:rPr>
-        <w:t>Punto 2.f: Mostrar los primeros 10 registros</w:t>
+        <w:t>Punto 2.f: Consulta exploratoria de validación de los primeros 10 registros</w:t>
+      </w:r>
+    </w:p>
+    <w:p>
+      <w:pPr>
+        <w:spacing w:after="80" w:before="0"/>
+      </w:pPr>
+      <w:r>
+        <w:rPr>
+          <w:b/>
+          <w:color w:val="505050"/>
+          <w:sz w:val="19"/>
+        </w:rPr>
+        <w:t xml:space="preserve">Requerimiento / Pregunta de la guía: </w:t>
+      </w:r>
+      <w:r>
+        <w:rPr>
+          <w:i/>
+          <w:color w:val="3C3C3C"/>
+          <w:sz w:val="19"/>
+        </w:rPr>
+        <w:t>Mostrar los primeros 10 registros</w:t>
       </w:r>
     </w:p>
     <w:p>
@@ -1590,7 +1737,7 @@
         <w:rPr>
           <w:sz w:val="18"/>
         </w:rPr>
-        <w:t>Figura 02f · Evidencia de pantalla completa con fecha y hora del sistema operativo visible.</w:t>
+        <w:t>Figura 02f · Captura de pantalla completa con fecha y hora del sistema operativo visible.</w:t>
       </w:r>
     </w:p>
     <w:p>
@@ -1598,12 +1745,12 @@
         <w:pStyle w:val="Heading2"/>
       </w:pPr>
       <w:r>
-        <w:t>Interpretación Reflexiva y Respuesta a la Pregunta</w:t>
+        <w:t>Interpretación de Resultados y Respuesta</w:t>
       </w:r>
     </w:p>
     <w:p>
       <w:r>
-        <w:t>Se ejecutó una consulta de muestreo para visualizar las primeras 10 transacciones almacenadas en tec_ronald. Se comprobó la correcta alineación de todas las columnas (código de factura, ítem, descripción, cantidad, fecha en formato estándar, precio unitario, ID de cliente y país).</w:t>
+        <w:t>Para validar la correcta ingesta y separación de los campos, ejecuté un SELECT con LIMIT 10. La salida tabular demuestra que cada valor (número de factura, código de artículo, descripción, cantidad, fecha formateada, precio, ID de cliente y país) se encuentra en su columna correspondiente.</w:t>
       </w:r>
     </w:p>
     <w:p>
@@ -1615,7 +1762,48 @@
         <w:rPr>
           <w:highlight w:val="yellow"/>
         </w:rPr>
-        <w:t>Punto 3.1 (Básico): ¿Cuál es el ingreso total generado por ventas válidas?</w:t>
+        <w:t>Punto 3.1: Ingreso total generado por ventas válidas</w:t>
+      </w:r>
+    </w:p>
+    <w:p>
+      <w:pPr>
+        <w:spacing w:after="80" w:before="0"/>
+      </w:pPr>
+      <w:r>
+        <w:rPr>
+          <w:b/>
+          <w:color w:val="505050"/>
+          <w:sz w:val="19"/>
+        </w:rPr>
+        <w:t xml:space="preserve">Requerimiento / Pregunta de la guía: </w:t>
+      </w:r>
+      <w:r>
+        <w:rPr>
+          <w:i/>
+          <w:color w:val="3C3C3C"/>
+          <w:sz w:val="19"/>
+        </w:rPr>
+        <w:t>¿Cuál es el ingreso total generado por ventas válidas?</w:t>
+      </w:r>
+    </w:p>
+    <w:p>
+      <w:pPr>
+        <w:spacing w:after="120" w:before="0"/>
+      </w:pPr>
+      <w:r>
+        <w:rPr>
+          <w:b/>
+          <w:color w:val="146E3C"/>
+          <w:sz w:val="19"/>
+        </w:rPr>
+        <w:t xml:space="preserve">Objetivo / KPI de negocio: </w:t>
+      </w:r>
+      <w:r>
+        <w:rPr>
+          <w:color w:val="146E3C"/>
+          <w:sz w:val="19"/>
+        </w:rPr>
+        <w:t>Ingreso total validado para reporting financiero.</w:t>
       </w:r>
     </w:p>
     <w:p>
@@ -1703,7 +1891,7 @@
         <w:rPr>
           <w:sz w:val="18"/>
         </w:rPr>
-        <w:t>Figura 03_01 · Evidencia de pantalla completa con fecha y hora del sistema operativo visible.</w:t>
+        <w:t>Figura 03_01 · Captura de pantalla completa con fecha y hora del sistema operativo visible.</w:t>
       </w:r>
     </w:p>
     <w:p>
@@ -1711,12 +1899,12 @@
         <w:pStyle w:val="Heading2"/>
       </w:pPr>
       <w:r>
-        <w:t>Interpretación Reflexiva y Respuesta a la Pregunta</w:t>
+        <w:t>Interpretación de Resultados y Respuesta</w:t>
       </w:r>
     </w:p>
     <w:p>
       <w:r>
-        <w:t>La consulta filtra transacciones anómalas (cantidades o precios unitarios negativos y nulos) y compradores anónimos, acumulando el producto de volumen por precio. Responde a la pregunta obteniendo un ingreso neto total validado de 8.703.833,70 £ (libras esterlinas). Este cálculo provee al negocio un KPI financiero depurado, indispensable para balances consolidados y proyecciones de facturación real libres de cancelaciones y registros espurios.</w:t>
+        <w:t>En esta consulta sumé el producto de la cantidad por el precio unitario, aplicando filtros para quedarnos únicamente con ventas válidas (cantidades mayores a cero, precios positivos y clientes identificados con ID). El resultado obtenido fue de 8.703.833,70 £ (libras esterlinas). La consulta responde de manera exacta a la pregunta planteada, entregando al área financiera una cifra neta y confiable para sus reportes al excluir devoluciones y registros anómalos.</w:t>
       </w:r>
     </w:p>
     <w:p>
@@ -1728,7 +1916,48 @@
         <w:rPr>
           <w:highlight w:val="yellow"/>
         </w:rPr>
-        <w:t>Punto 3.2 (Básico): ¿Cuáles son los 10 productos más vendidos por cantidad?</w:t>
+        <w:t>Punto 3.2: Los 10 productos más vendidos por cantidad</w:t>
+      </w:r>
+    </w:p>
+    <w:p>
+      <w:pPr>
+        <w:spacing w:after="80" w:before="0"/>
+      </w:pPr>
+      <w:r>
+        <w:rPr>
+          <w:b/>
+          <w:color w:val="505050"/>
+          <w:sz w:val="19"/>
+        </w:rPr>
+        <w:t xml:space="preserve">Requerimiento / Pregunta de la guía: </w:t>
+      </w:r>
+      <w:r>
+        <w:rPr>
+          <w:i/>
+          <w:color w:val="3C3C3C"/>
+          <w:sz w:val="19"/>
+        </w:rPr>
+        <w:t>¿Cuáles son los 10 productos más vendidos por cantidad?</w:t>
+      </w:r>
+    </w:p>
+    <w:p>
+      <w:pPr>
+        <w:spacing w:after="120" w:before="0"/>
+      </w:pPr>
+      <w:r>
+        <w:rPr>
+          <w:b/>
+          <w:color w:val="146E3C"/>
+          <w:sz w:val="19"/>
+        </w:rPr>
+        <w:t xml:space="preserve">Objetivo / KPI de negocio: </w:t>
+      </w:r>
+      <w:r>
+        <w:rPr>
+          <w:color w:val="146E3C"/>
+          <w:sz w:val="19"/>
+        </w:rPr>
+        <w:t>Top productos para priorizar stock y promoción.</w:t>
       </w:r>
     </w:p>
     <w:p>
@@ -1822,7 +2051,7 @@
         <w:rPr>
           <w:sz w:val="18"/>
         </w:rPr>
-        <w:t>Figura 03_02 · Evidencia de pantalla completa con fecha y hora del sistema operativo visible.</w:t>
+        <w:t>Figura 03_02 · Captura de pantalla completa con fecha y hora del sistema operativo visible.</w:t>
       </w:r>
     </w:p>
     <w:p>
@@ -1830,12 +2059,12 @@
         <w:pStyle w:val="Heading2"/>
       </w:pPr>
       <w:r>
-        <w:t>Interpretación Reflexiva y Respuesta a la Pregunta</w:t>
+        <w:t>Interpretación de Resultados y Respuesta</w:t>
       </w:r>
     </w:p>
     <w:p>
       <w:r>
-        <w:t>La consulta clasifica el catálogo en función del volumen absoluto de unidades despachadas y la penetración en órdenes independientes. Responde a la pregunta identificando que artículos de regalo y decoración como 'WORLD WAR 2 GLIDERS ASSTD DESIGNS' y 'JUMBO BAG RED RETROSPOT' dominan ampliamente con más de 45.000 y 47.000 unidades vendidas. Este resultado orienta al área de aprovisionamiento para asegurar inventario de seguridad y priorizar campañas de cross-selling.</w:t>
+        <w:t>Agrupé las ventas positivas por la descripción de cada producto, calculando tanto las unidades totales como el número de pedidos distintos donde apareció. Los artículos líderes fueron 'WORLD WAR 2 GLIDERS ASSTD DESIGNS' (más de 53.000 unidades) y bolsas reutilizables 'JUMBO BAG RED RETROSPOT' (más de 47.000 unidades). La consulta responde a la pregunta y resulta muy útil para el negocio porque ayuda a priorizar el stock de los productos con mayor demanda y planificar ofertas cruzadas.</w:t>
       </w:r>
     </w:p>
     <w:p>
@@ -1847,7 +2076,48 @@
         <w:rPr>
           <w:highlight w:val="yellow"/>
         </w:rPr>
-        <w:t>Punto 3.3 (Básico): ¿Cuántos clientes únicos hay por país?</w:t>
+        <w:t>Punto 3.3: Cantidad y porcentaje de clientes únicos por país</w:t>
+      </w:r>
+    </w:p>
+    <w:p>
+      <w:pPr>
+        <w:spacing w:after="80" w:before="0"/>
+      </w:pPr>
+      <w:r>
+        <w:rPr>
+          <w:b/>
+          <w:color w:val="505050"/>
+          <w:sz w:val="19"/>
+        </w:rPr>
+        <w:t xml:space="preserve">Requerimiento / Pregunta de la guía: </w:t>
+      </w:r>
+      <w:r>
+        <w:rPr>
+          <w:i/>
+          <w:color w:val="3C3C3C"/>
+          <w:sz w:val="19"/>
+        </w:rPr>
+        <w:t>¿Cuántos clientes únicos hay por país?</w:t>
+      </w:r>
+    </w:p>
+    <w:p>
+      <w:pPr>
+        <w:spacing w:after="120" w:before="0"/>
+      </w:pPr>
+      <w:r>
+        <w:rPr>
+          <w:b/>
+          <w:color w:val="146E3C"/>
+          <w:sz w:val="19"/>
+        </w:rPr>
+        <w:t xml:space="preserve">Objetivo / KPI de negocio: </w:t>
+      </w:r>
+      <w:r>
+        <w:rPr>
+          <w:color w:val="146E3C"/>
+          <w:sz w:val="19"/>
+        </w:rPr>
+        <w:t>Distribución geográfica para focalizar expansión.</w:t>
       </w:r>
     </w:p>
     <w:p>
@@ -1943,7 +2213,7 @@
         <w:rPr>
           <w:sz w:val="18"/>
         </w:rPr>
-        <w:t>Figura 03_03 · Evidencia de pantalla completa con fecha y hora del sistema operativo visible.</w:t>
+        <w:t>Figura 03_03 · Captura de pantalla completa con fecha y hora del sistema operativo visible.</w:t>
       </w:r>
     </w:p>
     <w:p>
@@ -1951,12 +2221,12 @@
         <w:pStyle w:val="Heading2"/>
       </w:pPr>
       <w:r>
-        <w:t>Interpretación Reflexiva y Respuesta a la Pregunta</w:t>
+        <w:t>Interpretación de Resultados y Respuesta</w:t>
       </w:r>
     </w:p>
     <w:p>
       <w:r>
-        <w:t>Utilizando funciones de ventana analítica OVER (), la consulta cuantifica la cantidad de compradores distintos por nación y su porcentaje relativo sobre el total global. Responde a la pregunta demostrando que el Reino Unido (United Kingdom) concentra una hegemonía absoluta con 3.950 clientes (90.37% del total de clientes registrados), seguido por Alemania (95 clientes, 2.17%) y Francia (87 clientes, 1.99%). Esto justifica que las estrategias de fidelización se concentren en el mercado local británico mientras se formulan planes piloto de expansión en Europa continental.</w:t>
+        <w:t>Utilicé la función de ventana analítica OVER () para contar los clientes únicos por país y calcular al mismo tiempo qué porcentaje representan del total. Los resultados muestran que el Reino Unido (United Kingdom) tiene 3.950 clientes registrados, lo que equivale al 90.37% de toda la base de usuarios, seguido muy de lejos por Alemania (95 clientes, 2.17%) y Francia (87 clientes, 1.99%). Esto responde con precisión a la pregunta y nos indica que el negocio es mayoritariamente local británico, sugiriendo que cualquier esfuerzo de expansión internacional debe iniciar en estos mercados vecinos.</w:t>
       </w:r>
     </w:p>
     <w:p>
@@ -1968,7 +2238,48 @@
         <w:rPr>
           <w:highlight w:val="yellow"/>
         </w:rPr>
-        <w:t>Punto 3.4 (Básico): ¿Cuál es el ticket promedio por orden?</w:t>
+        <w:t>Punto 3.4: Ticket promedio frente a la mediana por orden</w:t>
+      </w:r>
+    </w:p>
+    <w:p>
+      <w:pPr>
+        <w:spacing w:after="80" w:before="0"/>
+      </w:pPr>
+      <w:r>
+        <w:rPr>
+          <w:b/>
+          <w:color w:val="505050"/>
+          <w:sz w:val="19"/>
+        </w:rPr>
+        <w:t xml:space="preserve">Requerimiento / Pregunta de la guía: </w:t>
+      </w:r>
+      <w:r>
+        <w:rPr>
+          <w:i/>
+          <w:color w:val="3C3C3C"/>
+          <w:sz w:val="19"/>
+        </w:rPr>
+        <w:t>¿Cuál es el ticket promedio por orden?</w:t>
+      </w:r>
+    </w:p>
+    <w:p>
+      <w:pPr>
+        <w:spacing w:after="120" w:before="0"/>
+      </w:pPr>
+      <w:r>
+        <w:rPr>
+          <w:b/>
+          <w:color w:val="146E3C"/>
+          <w:sz w:val="19"/>
+        </w:rPr>
+        <w:t xml:space="preserve">Objetivo / KPI de negocio: </w:t>
+      </w:r>
+      <w:r>
+        <w:rPr>
+          <w:color w:val="146E3C"/>
+          <w:sz w:val="19"/>
+        </w:rPr>
+        <w:t>Ticket promedio vs. mediana para detectar sesgo por outliers.</w:t>
       </w:r>
     </w:p>
     <w:p>
@@ -2066,7 +2377,7 @@
         <w:rPr>
           <w:sz w:val="18"/>
         </w:rPr>
-        <w:t>Figura 03_04 · Evidencia de pantalla completa con fecha y hora del sistema operativo visible.</w:t>
+        <w:t>Figura 03_04 · Captura de pantalla completa con fecha y hora del sistema operativo visible.</w:t>
       </w:r>
     </w:p>
     <w:p>
@@ -2074,12 +2385,12 @@
         <w:pStyle w:val="Heading2"/>
       </w:pPr>
       <w:r>
-        <w:t>Interpretación Reflexiva y Respuesta a la Pregunta</w:t>
+        <w:t>Interpretación de Resultados y Respuesta</w:t>
       </w:r>
     </w:p>
     <w:p>
       <w:r>
-        <w:t>La consulta totaliza cada orden mediante una subconsulta previa y calcula simultáneamente la media aritmética y el percentil 50 (mediana). Responde a la pregunta revelando un ticket promedio de 472.58 £ frente a una mediana aproximada de 208.50 £. Esta diferencia cuantitativa sustancial evidencia un sesgo por outliers (pedidos mayoristas de volumen extraordinario), indicando que la mediana refleja con mayor fidelidad el comportamiento transaccional del comprador minorista cotidiano.</w:t>
+        <w:t>Primero totalicé el monto de cada orden mediante una subconsulta y luego calculé el promedio aritmético y la mediana (percentil 50). El ticket promedio dio 472.58 £, mientras que la mediana se situó en aproximadamente 208.50 £. Esta diferencia responde directamente a la pregunta y demuestra que el promedio está sesgado hacia arriba por pedidos mayoristas de gran volumen. Por lo tanto, la mediana refleja con mucha más precisión lo que realmente gasta un cliente minorista típico en una compra habitual.</w:t>
       </w:r>
     </w:p>
     <w:p>
@@ -2091,7 +2402,48 @@
         <w:rPr>
           <w:highlight w:val="yellow"/>
         </w:rPr>
-        <w:t>Punto 3.5 (Básico): ¿Cómo evolucionan las ventas mes a mes?</w:t>
+        <w:t>Punto 3.5: Evolución temporal de las ventas mes a mes</w:t>
+      </w:r>
+    </w:p>
+    <w:p>
+      <w:pPr>
+        <w:spacing w:after="80" w:before="0"/>
+      </w:pPr>
+      <w:r>
+        <w:rPr>
+          <w:b/>
+          <w:color w:val="505050"/>
+          <w:sz w:val="19"/>
+        </w:rPr>
+        <w:t xml:space="preserve">Requerimiento / Pregunta de la guía: </w:t>
+      </w:r>
+      <w:r>
+        <w:rPr>
+          <w:i/>
+          <w:color w:val="3C3C3C"/>
+          <w:sz w:val="19"/>
+        </w:rPr>
+        <w:t>¿Cómo evolucionan las ventas mes a mes?</w:t>
+      </w:r>
+    </w:p>
+    <w:p>
+      <w:pPr>
+        <w:spacing w:after="120" w:before="0"/>
+      </w:pPr>
+      <w:r>
+        <w:rPr>
+          <w:b/>
+          <w:color w:val="146E3C"/>
+          <w:sz w:val="19"/>
+        </w:rPr>
+        <w:t xml:space="preserve">Objetivo / KPI de negocio: </w:t>
+      </w:r>
+      <w:r>
+        <w:rPr>
+          <w:color w:val="146E3C"/>
+          <w:sz w:val="19"/>
+        </w:rPr>
+        <w:t>Tendencia mensual para planificación de inventario.</w:t>
       </w:r>
     </w:p>
     <w:p>
@@ -2185,7 +2537,7 @@
         <w:rPr>
           <w:sz w:val="18"/>
         </w:rPr>
-        <w:t>Figura 03_05 · Evidencia de pantalla completa con fecha y hora del sistema operativo visible.</w:t>
+        <w:t>Figura 03_05 · Captura de pantalla completa con fecha y hora del sistema operativo visible.</w:t>
       </w:r>
     </w:p>
     <w:p>
@@ -2193,12 +2545,12 @@
         <w:pStyle w:val="Heading2"/>
       </w:pPr>
       <w:r>
-        <w:t>Interpretación Reflexiva y Respuesta a la Pregunta</w:t>
+        <w:t>Interpretación de Resultados y Respuesta</w:t>
       </w:r>
     </w:p>
     <w:p>
       <w:r>
-        <w:t>Agrupando por año y mes a partir de las marcas temporales de la transacción, la consulta evalúa la evolución temporal del flujo de órdenes y facturación. Responde a la pregunta demostrando un crecimiento progresivo desde el primer semestre de 2011 (promediando entre 500.000 y 750.000 £ mensuales) hasta alcanzar el máximo histórico en noviembre de 2011 con 2.767 pedidos y más de 1.505.319 £ facturadas, confirmando el marcado impacto del periodo comercial pre-navideño (Black Friday / campañas de fin de año).</w:t>
+        <w:t>Agrupando por año y mes a partir de InvoiceDate, analicé la tendencia en la cantidad de pedidos y los ingresos generados. Durante el primer semestre de 2011 las ventas se mantuvieron estables entre 500.000 y 750.000 £ mensuales; sin embargo, a partir de septiembre inicia un crecimiento muy fuerte que culmina en noviembre de 2011 con 2.767 pedidos y más de 1.5 millones de libras facturadas. La consulta responde a la pregunta y evidencia con datos reales el pico comercial de fin de año, lo que permite a la empresa abastecer sus almacenes a tiempo.</w:t>
       </w:r>
     </w:p>
     <w:p>
@@ -2210,7 +2562,48 @@
         <w:rPr>
           <w:highlight w:val="yellow"/>
         </w:rPr>
-        <w:t>Punto 3.6 (Intermedio): ¿Qué productos tienen mayor tasa de devolución/cancelación?</w:t>
+        <w:t>Punto 3.6: Productos con mayor tasa de devolución o cancelación</w:t>
+      </w:r>
+    </w:p>
+    <w:p>
+      <w:pPr>
+        <w:spacing w:after="80" w:before="0"/>
+      </w:pPr>
+      <w:r>
+        <w:rPr>
+          <w:b/>
+          <w:color w:val="505050"/>
+          <w:sz w:val="19"/>
+        </w:rPr>
+        <w:t xml:space="preserve">Requerimiento / Pregunta de la guía: </w:t>
+      </w:r>
+      <w:r>
+        <w:rPr>
+          <w:i/>
+          <w:color w:val="3C3C3C"/>
+          <w:sz w:val="19"/>
+        </w:rPr>
+        <w:t>¿Qué productos tienen mayor tasa de devolución/cancelación?</w:t>
+      </w:r>
+    </w:p>
+    <w:p>
+      <w:pPr>
+        <w:spacing w:after="120" w:before="0"/>
+      </w:pPr>
+      <w:r>
+        <w:rPr>
+          <w:b/>
+          <w:color w:val="146E3C"/>
+          <w:sz w:val="19"/>
+        </w:rPr>
+        <w:t xml:space="preserve">Objetivo / KPI de negocio: </w:t>
+      </w:r>
+      <w:r>
+        <w:rPr>
+          <w:color w:val="146E3C"/>
+          <w:sz w:val="19"/>
+        </w:rPr>
+        <w:t>% devoluciones por producto para reducir desperdicio logístico.</w:t>
       </w:r>
     </w:p>
     <w:p>
@@ -2314,7 +2707,7 @@
         <w:rPr>
           <w:sz w:val="18"/>
         </w:rPr>
-        <w:t>Figura 03_06 · Evidencia de pantalla completa con fecha y hora del sistema operativo visible.</w:t>
+        <w:t>Figura 03_06 · Captura de pantalla completa con fecha y hora del sistema operativo visible.</w:t>
       </w:r>
     </w:p>
     <w:p>
@@ -2322,12 +2715,12 @@
         <w:pStyle w:val="Heading2"/>
       </w:pPr>
       <w:r>
-        <w:t>Interpretación Reflexiva y Respuesta a la Pregunta</w:t>
+        <w:t>Interpretación de Resultados y Respuesta</w:t>
       </w:r>
     </w:p>
     <w:p>
       <w:r>
-        <w:t>La consulta analiza artículos con presencia estadística mínima (&gt;=10 transacciones) y calcula el cociente entre pedidos devueltos o cancelados (identificados con cantidades negativas o código 'C%') y el total de transacciones. Responde a la pregunta señalando referencias donde la tasa de cancelación excede el 30% al 50%. Esta información es crítica para el departamento de control de calidad y logística inversa, permitiendo detectar productos frágiles, con fichas técnicas erróneas o fallas de embalaje.</w:t>
+        <w:t>Filtré los productos con al menos 10 movimientos y calculé el porcentaje de devoluciones sobre el total de registros de cada artículo. Se encontraron productos cuyas tasas de retorno superan el 30% e incluso el 50%. La consulta responde a la pregunta y resulta fundamental para el negocio, ya que permite a control de calidad y logística revisar si estos productos llegan dañados, si tienen fallas de fabricación o si la descripción en la web genera falsas expectativas en el cliente, ayudando a reducir costos de devolución.</w:t>
       </w:r>
     </w:p>
     <w:p>
@@ -2339,7 +2732,48 @@
         <w:rPr>
           <w:highlight w:val="yellow"/>
         </w:rPr>
-        <w:t>Punto 3.7 (Intermedio): ¿En qué hora del día hay más ventas y mayor ticket?</w:t>
+        <w:t>Punto 3.7: Análisis de ventas y ticket promedio por hora del día</w:t>
+      </w:r>
+    </w:p>
+    <w:p>
+      <w:pPr>
+        <w:spacing w:after="80" w:before="0"/>
+      </w:pPr>
+      <w:r>
+        <w:rPr>
+          <w:b/>
+          <w:color w:val="505050"/>
+          <w:sz w:val="19"/>
+        </w:rPr>
+        <w:t xml:space="preserve">Requerimiento / Pregunta de la guía: </w:t>
+      </w:r>
+      <w:r>
+        <w:rPr>
+          <w:i/>
+          <w:color w:val="3C3C3C"/>
+          <w:sz w:val="19"/>
+        </w:rPr>
+        <w:t>¿En qué hora del día hay más ventas y mayor ticket?</w:t>
+      </w:r>
+    </w:p>
+    <w:p>
+      <w:pPr>
+        <w:spacing w:after="120" w:before="0"/>
+      </w:pPr>
+      <w:r>
+        <w:rPr>
+          <w:b/>
+          <w:color w:val="146E3C"/>
+          <w:sz w:val="19"/>
+        </w:rPr>
+        <w:t xml:space="preserve">Objetivo / KPI de negocio: </w:t>
+      </w:r>
+      <w:r>
+        <w:rPr>
+          <w:color w:val="146E3C"/>
+          <w:sz w:val="19"/>
+        </w:rPr>
+        <w:t>Hora pico para programar campañas de email/push.</w:t>
       </w:r>
     </w:p>
     <w:p>
@@ -2433,7 +2867,7 @@
         <w:rPr>
           <w:sz w:val="18"/>
         </w:rPr>
-        <w:t>Figura 03_07 · Evidencia de pantalla completa con fecha y hora del sistema operativo visible.</w:t>
+        <w:t>Figura 03_07 · Captura de pantalla completa con fecha y hora del sistema operativo visible.</w:t>
       </w:r>
     </w:p>
     <w:p>
@@ -2441,12 +2875,12 @@
         <w:pStyle w:val="Heading2"/>
       </w:pPr>
       <w:r>
-        <w:t>Interpretación Reflexiva y Respuesta a la Pregunta</w:t>
+        <w:t>Interpretación de Resultados y Respuesta</w:t>
       </w:r>
     </w:p>
     <w:p>
       <w:r>
-        <w:t>Extrayendo la hora de cada compra, la consulta determina los momentos de mayor concentración transaccional e importe promedio. Responde a la pregunta evidenciando que la hora pico de facturación se sitúa entre las 12:00 y las 14:00 (con más de 3.000 pedidos por hora y picos de recaudación superiores a 1.7 millones de libras), mientras que los tickets más elevados se registran en horas de la mañana temprano (7:00 a 9:00). Esto establece el horario ideal para programar campañas publicitarias, emails y promociones flash.</w:t>
+        <w:t>Extrayendo la hora de cada compra con HOUR(InvoiceDate), evalué el volumen de órdenes, los ingresos totales y el ticket promedio a lo largo de las 24 horas. Se constata que la hora pico de pedidos e ingresos ocurre al mediodía, entre las 12:00 y las 14:00 (con más de 3.000 pedidos y 1.7 millones de libras en esa franja), mientras que las compras con tickets más altos suceden temprano en la mañana (entre 7:00 y 9:00). La consulta responde con exactitud y le señala al equipo de marketing el momento óptimo para enviar correos promocionales y notificaciones push.</w:t>
       </w:r>
     </w:p>
     <w:p>
@@ -2458,7 +2892,48 @@
         <w:rPr>
           <w:highlight w:val="yellow"/>
         </w:rPr>
-        <w:t>Punto 3.8 (Intermedio): ¿Qué productos son estacionales? (Ventas por mes)</w:t>
+        <w:t>Punto 3.8: Detección de productos estacionales a lo largo del año</w:t>
+      </w:r>
+    </w:p>
+    <w:p>
+      <w:pPr>
+        <w:spacing w:after="80" w:before="0"/>
+      </w:pPr>
+      <w:r>
+        <w:rPr>
+          <w:b/>
+          <w:color w:val="505050"/>
+          <w:sz w:val="19"/>
+        </w:rPr>
+        <w:t xml:space="preserve">Requerimiento / Pregunta de la guía: </w:t>
+      </w:r>
+      <w:r>
+        <w:rPr>
+          <w:i/>
+          <w:color w:val="3C3C3C"/>
+          <w:sz w:val="19"/>
+        </w:rPr>
+        <w:t>¿Qué productos son estacionales? (Ventas por mes)</w:t>
+      </w:r>
+    </w:p>
+    <w:p>
+      <w:pPr>
+        <w:spacing w:after="120" w:before="0"/>
+      </w:pPr>
+      <w:r>
+        <w:rPr>
+          <w:b/>
+          <w:color w:val="146E3C"/>
+          <w:sz w:val="19"/>
+        </w:rPr>
+        <w:t xml:space="preserve">Objetivo / KPI de negocio: </w:t>
+      </w:r>
+      <w:r>
+        <w:rPr>
+          <w:color w:val="146E3C"/>
+          <w:sz w:val="19"/>
+        </w:rPr>
+        <w:t>Productos con &gt;40% de ventas en 1-2 meses → planificación de stock estacional.</w:t>
       </w:r>
     </w:p>
     <w:p>
@@ -2556,7 +3031,7 @@
         <w:rPr>
           <w:sz w:val="18"/>
         </w:rPr>
-        <w:t>Figura 03_08 · Evidencia de pantalla completa con fecha y hora del sistema operativo visible.</w:t>
+        <w:t>Figura 03_08 · Captura de pantalla completa con fecha y hora del sistema operativo visible.</w:t>
       </w:r>
     </w:p>
     <w:p>
@@ -2564,12 +3039,12 @@
         <w:pStyle w:val="Heading2"/>
       </w:pPr>
       <w:r>
-        <w:t>Interpretación Reflexiva y Respuesta a la Pregunta</w:t>
+        <w:t>Interpretación de Resultados y Respuesta</w:t>
       </w:r>
     </w:p>
     <w:p>
       <w:r>
-        <w:t>Mediante particiones de ventana analítica por producto, la consulta identifica qué porcentaje de sus ventas anuales se concentra en cada mes del año. Responde a la pregunta localizando artículos que concentran más del 40% al 60% de su rotación en únicamente uno o dos meses del año (principalmente artículos festivos en octubre y noviembre). Esta información permite diseñar una gestión de compras estacional, evitando costos de almacenamiento innecesarios durante el resto del ejercicio anual.</w:t>
+        <w:t>Mediante una función de ventana particionada por producto, calculé qué porcentaje de las ventas anuales de cada artículo se concentra en cada mes. La consulta identifica productos que concentran más del 40% al 60% de sus ventas en solo uno o dos meses (por ejemplo, adornos navideños en octubre y noviembre). Esto responde claramente a la pregunta y permite a la empresa comprar estos artículos únicamente para la temporada alta, evitando costos de almacenamiento innecesarios el resto del año.</w:t>
       </w:r>
     </w:p>
     <w:p>
@@ -2581,7 +3056,48 @@
         <w:rPr>
           <w:highlight w:val="yellow"/>
         </w:rPr>
-        <w:t>Punto 3.9 (Intermedio): ¿Qué productos tienen mayor margen implícito? (Precio unitario como proxy)</w:t>
+        <w:t>Punto 3.9: Productos con mayor margen implícito (Score proxy)</w:t>
+      </w:r>
+    </w:p>
+    <w:p>
+      <w:pPr>
+        <w:spacing w:after="80" w:before="0"/>
+      </w:pPr>
+      <w:r>
+        <w:rPr>
+          <w:b/>
+          <w:color w:val="505050"/>
+          <w:sz w:val="19"/>
+        </w:rPr>
+        <w:t xml:space="preserve">Requerimiento / Pregunta de la guía: </w:t>
+      </w:r>
+      <w:r>
+        <w:rPr>
+          <w:i/>
+          <w:color w:val="3C3C3C"/>
+          <w:sz w:val="19"/>
+        </w:rPr>
+        <w:t>¿Qué productos tienen mayor margen implícito? (Precio unitario como proxy)</w:t>
+      </w:r>
+    </w:p>
+    <w:p>
+      <w:pPr>
+        <w:spacing w:after="120" w:before="0"/>
+      </w:pPr>
+      <w:r>
+        <w:rPr>
+          <w:b/>
+          <w:color w:val="146E3C"/>
+          <w:sz w:val="19"/>
+        </w:rPr>
+        <w:t xml:space="preserve">Objetivo / KPI de negocio: </w:t>
+      </w:r>
+      <w:r>
+        <w:rPr>
+          <w:color w:val="146E3C"/>
+          <w:sz w:val="19"/>
+        </w:rPr>
+        <w:t>Score de margen para priorizar productos en promociones (alto precio × alta rotación).</w:t>
       </w:r>
     </w:p>
     <w:p>
@@ -2679,7 +3195,7 @@
         <w:rPr>
           <w:sz w:val="18"/>
         </w:rPr>
-        <w:t>Figura 03_09 · Evidencia de pantalla completa con fecha y hora del sistema operativo visible.</w:t>
+        <w:t>Figura 03_09 · Captura de pantalla completa con fecha y hora del sistema operativo visible.</w:t>
       </w:r>
     </w:p>
     <w:p>
@@ -2687,12 +3203,12 @@
         <w:pStyle w:val="Heading2"/>
       </w:pPr>
       <w:r>
-        <w:t>Interpretación Reflexiva y Respuesta a la Pregunta</w:t>
+        <w:t>Interpretación de Resultados y Respuesta</w:t>
       </w:r>
     </w:p>
     <w:p>
       <w:r>
-        <w:t>La consulta formula un score proxy multiplicando el precio promedio unitario por la recurrencia de pedidos donde participa el ítem, filtrando productos con al menos 5 pedidos. Responde a la pregunta identificando los artículos que combinan un alto valor unitario con una rotación de mercado saludable. Estos productos de alto margen constituyen los activos más rentables del catálogo y deben ocupar posiciones privilegiadas en el diseño visual de la plataforma de e-commerce.</w:t>
+        <w:t>Para estimar el margen cuando no se dispone del costo unitario, calculé un score multiplicando el precio promedio por la cantidad de pedidos donde participó el producto. Este cálculo premia a los productos de precio alto que además tienen buena rotación de ventas, como sets decorativos y piezas especiales. La consulta responde a la pregunta señalando los productos que mayor beneficio económico bruto aportan a la tienda, ideales para destacar en promociones principales y vitrinas digitales.</w:t>
       </w:r>
     </w:p>
     <w:p>
@@ -2704,7 +3220,48 @@
         <w:rPr>
           <w:highlight w:val="yellow"/>
         </w:rPr>
-        <w:t>Punto 3.10 (Intermedio): ¿Hay diferencia de comportamiento entre clientes con/sin ID registrado?</w:t>
+        <w:t>Punto 3.10: Comparativa entre clientes registrados y clientes anónimos</w:t>
+      </w:r>
+    </w:p>
+    <w:p>
+      <w:pPr>
+        <w:spacing w:after="80" w:before="0"/>
+      </w:pPr>
+      <w:r>
+        <w:rPr>
+          <w:b/>
+          <w:color w:val="505050"/>
+          <w:sz w:val="19"/>
+        </w:rPr>
+        <w:t xml:space="preserve">Requerimiento / Pregunta de la guía: </w:t>
+      </w:r>
+      <w:r>
+        <w:rPr>
+          <w:i/>
+          <w:color w:val="3C3C3C"/>
+          <w:sz w:val="19"/>
+        </w:rPr>
+        <w:t>¿Hay diferencia de comportamiento entre clientes con/sin ID registrado?</w:t>
+      </w:r>
+    </w:p>
+    <w:p>
+      <w:pPr>
+        <w:spacing w:after="120" w:before="0"/>
+      </w:pPr>
+      <w:r>
+        <w:rPr>
+          <w:b/>
+          <w:color w:val="146E3C"/>
+          <w:sz w:val="19"/>
+        </w:rPr>
+        <w:t xml:space="preserve">Objetivo / KPI de negocio: </w:t>
+      </w:r>
+      <w:r>
+        <w:rPr>
+          <w:color w:val="146E3C"/>
+          <w:sz w:val="19"/>
+        </w:rPr>
+        <w:t>Diferencia en ticket promedio → justifica campañas de registro/loyalty.</w:t>
       </w:r>
     </w:p>
     <w:p>
@@ -2796,7 +3353,7 @@
         <w:rPr>
           <w:sz w:val="18"/>
         </w:rPr>
-        <w:t>Figura 03_10 · Evidencia de pantalla completa con fecha y hora del sistema operativo visible.</w:t>
+        <w:t>Figura 03_10 · Captura de pantalla completa con fecha y hora del sistema operativo visible.</w:t>
       </w:r>
     </w:p>
     <w:p>
@@ -2804,12 +3361,12 @@
         <w:pStyle w:val="Heading2"/>
       </w:pPr>
       <w:r>
-        <w:t>Interpretación Reflexiva y Respuesta a la Pregunta</w:t>
+        <w:t>Interpretación de Resultados y Respuesta</w:t>
       </w:r>
     </w:p>
     <w:p>
       <w:r>
-        <w:t>Segmentando las ventas según la presencia o ausencia de CustomerID, la consulta compara las métricas clave de cada grupo. Responde categóricamente a la pregunta demostrando que los clientes registrados representan más del 80% de la facturación global con pedidos mucho más estables y repetitivos, mientras que los compradores anónimos generan un ticket promedio por ítem menor y representan compras casuales. Esto justifica económicamente otorgar cupones y beneficios por crear cuenta en la plataforma.</w:t>
+        <w:t>Separé las compras según si tenían CustomerID o no para comparar el comportamiento de ambos grupos. Los resultados demuestran que los clientes registrados generan más del 80% de los ingresos totales y compran de forma recurrente con tickets más elevados, mientras que los compradores anónimos realizan compras esporádicas. La consulta responde contundentemente a la pregunta y justifica invertir en programas de bienvenida, puntos de fidelidad y descuentos por registrarse para transformar usuarios casuales en clientes frecuentes.</w:t>
       </w:r>
     </w:p>
     <w:p>
@@ -2821,7 +3378,48 @@
         <w:rPr>
           <w:highlight w:val="yellow"/>
         </w:rPr>
-        <w:t>Punto 3.11 (Intermedio): ¿Qué días de la semana tienen mayor conversión?</w:t>
+        <w:t>Punto 3.11: Días de la semana con mayor conversión comercial</w:t>
+      </w:r>
+    </w:p>
+    <w:p>
+      <w:pPr>
+        <w:spacing w:after="80" w:before="0"/>
+      </w:pPr>
+      <w:r>
+        <w:rPr>
+          <w:b/>
+          <w:color w:val="505050"/>
+          <w:sz w:val="19"/>
+        </w:rPr>
+        <w:t xml:space="preserve">Requerimiento / Pregunta de la guía: </w:t>
+      </w:r>
+      <w:r>
+        <w:rPr>
+          <w:i/>
+          <w:color w:val="3C3C3C"/>
+          <w:sz w:val="19"/>
+        </w:rPr>
+        <w:t>¿Qué días de la semana tienen mayor conversión?</w:t>
+      </w:r>
+    </w:p>
+    <w:p>
+      <w:pPr>
+        <w:spacing w:after="120" w:before="0"/>
+      </w:pPr>
+      <w:r>
+        <w:rPr>
+          <w:b/>
+          <w:color w:val="146E3C"/>
+          <w:sz w:val="19"/>
+        </w:rPr>
+        <w:t xml:space="preserve">Objetivo / KPI de negocio: </w:t>
+      </w:r>
+      <w:r>
+        <w:rPr>
+          <w:color w:val="146E3C"/>
+          <w:sz w:val="19"/>
+        </w:rPr>
+        <w:t>Día con mayor ingreso para programar lanzamientos/promociones.</w:t>
       </w:r>
     </w:p>
     <w:p>
@@ -2921,7 +3519,7 @@
         <w:rPr>
           <w:sz w:val="18"/>
         </w:rPr>
-        <w:t>Figura 03_11 · Evidencia de pantalla completa con fecha y hora del sistema operativo visible.</w:t>
+        <w:t>Figura 03_11 · Captura de pantalla completa con fecha y hora del sistema operativo visible.</w:t>
       </w:r>
     </w:p>
     <w:p>
@@ -2929,12 +3527,12 @@
         <w:pStyle w:val="Heading2"/>
       </w:pPr>
       <w:r>
-        <w:t>Interpretación Reflexiva y Respuesta a la Pregunta</w:t>
+        <w:t>Interpretación de Resultados y Respuesta</w:t>
       </w:r>
     </w:p>
     <w:p>
       <w:r>
-        <w:t>Clasificando las órdenes según el día de la semana (donde 1=Domingo y 7=Sábado), la consulta evalúa el volumen de ingresos y transacciones diarias. Responde a la pregunta constatando que los días laborables centrales (jueves con más de 2.1 millones de libras y martes con más de 1.9 millones) lideran con holgura la captación de ingresos, mientras que los fines de semana registran un nivel casi nulo de facturación en el sistema minorista. Esto determina que el despliegue de lanzamientos y correos promocionales debe agendarse estrictamente entre martes y jueves.</w:t>
+        <w:t>Agrupé las ventas por el día de la semana con DAYOFWEEK (donde 1 es domingo y 7 sábado). Los resultados muestran con claridad que los días de mayor facturación son los jueves (más de 2.1 millones de libras) y los martes (cerca de 1.9 millones), mientras que los fines de semana la actividad en esta tienda mayorista/minorista es casi nula. La consulta responde a la pregunta e indica con certeza que cualquier lanzamiento de productos o envío masivo de boletines comerciales debe programarse estrictamente entre martes y jueves.</w:t>
       </w:r>
     </w:p>
     <w:p>
@@ -2946,7 +3544,48 @@
         <w:rPr>
           <w:highlight w:val="yellow"/>
         </w:rPr>
-        <w:t>Punto 3.12 (Intermedio): ¿Cuál es la tasa de cancelación por país?</w:t>
+        <w:t>Punto 3.12: Tasa de cancelación de pedidos por país</w:t>
+      </w:r>
+    </w:p>
+    <w:p>
+      <w:pPr>
+        <w:spacing w:after="80" w:before="0"/>
+      </w:pPr>
+      <w:r>
+        <w:rPr>
+          <w:b/>
+          <w:color w:val="505050"/>
+          <w:sz w:val="19"/>
+        </w:rPr>
+        <w:t xml:space="preserve">Requerimiento / Pregunta de la guía: </w:t>
+      </w:r>
+      <w:r>
+        <w:rPr>
+          <w:i/>
+          <w:color w:val="3C3C3C"/>
+          <w:sz w:val="19"/>
+        </w:rPr>
+        <w:t>¿Cuál es la tasa de cancelación por país?</w:t>
+      </w:r>
+    </w:p>
+    <w:p>
+      <w:pPr>
+        <w:spacing w:after="120" w:before="0"/>
+      </w:pPr>
+      <w:r>
+        <w:rPr>
+          <w:b/>
+          <w:color w:val="146E3C"/>
+          <w:sz w:val="19"/>
+        </w:rPr>
+        <w:t xml:space="preserve">Objetivo / KPI de negocio: </w:t>
+      </w:r>
+      <w:r>
+        <w:rPr>
+          <w:color w:val="146E3C"/>
+          <w:sz w:val="19"/>
+        </w:rPr>
+        <w:t>Países con alta cancelación → investigar causas logísticas/culturales.</w:t>
       </w:r>
     </w:p>
     <w:p>
@@ -3048,7 +3687,7 @@
         <w:rPr>
           <w:sz w:val="18"/>
         </w:rPr>
-        <w:t>Figura 03_12 · Evidencia de pantalla completa con fecha y hora del sistema operativo visible.</w:t>
+        <w:t>Figura 03_12 · Captura de pantalla completa con fecha y hora del sistema operativo visible.</w:t>
       </w:r>
     </w:p>
     <w:p>
@@ -3056,12 +3695,12 @@
         <w:pStyle w:val="Heading2"/>
       </w:pPr>
       <w:r>
-        <w:t>Interpretación Reflexiva y Respuesta a la Pregunta</w:t>
+        <w:t>Interpretación de Resultados y Respuesta</w:t>
       </w:r>
     </w:p>
     <w:p>
       <w:r>
-        <w:t>La consulta calcula el porcentaje de cancelaciones y devoluciones por país para aquellos mercados con al menos 50 transacciones registradas. Responde a la pregunta identificando que países como Estados Unidos o Japón presentan tasas relativas de cancelación más elevadas que el promedio local británico. Esto orienta a los equipos de operaciones a revisar los tiempos de entrega transfronteriza, aranceles aduaneros y opciones de pago locales para disminuir el desestimiento de compra en el extranjero.</w:t>
+        <w:t>Calculé el porcentaje de pedidos cancelados o devueltos en cada país para aquellos mercados con al menos 50 transacciones. Se observó que mercados como Estados Unidos o Japón presentan porcentajes de cancelación comparativamente mayores a los del mercado doméstico británico. La consulta responde a la pregunta y orienta al equipo de operaciones a revisar posibles demoras en envíos internacionales, aranceles imprevistos o problemas con medios de pago locales para mejorar la experiencia en compras del exterior.</w:t>
       </w:r>
     </w:p>
     <w:p>
@@ -3074,22 +3713,22 @@
         <w:pStyle w:val="Heading1"/>
       </w:pPr>
       <w:r>
-        <w:t>3. Conclusiones y Reflexión Técnica</w:t>
+        <w:t>3. Conclusiones y Aprendizajes</w:t>
       </w:r>
     </w:p>
     <w:p>
       <w:r>
-        <w:t>1. **Eficacia de la Arquitectura Distribuida:** El clúster Docker implementado con Apache Hadoop 3.4.1 y Apache Hive 4.0.1 demostró una capacidad de procesamiento analítico masivo óptima, ejecutando consultas de agregación y funciones analíticas de ventana sobre más de 540.000 filas en tiempos inferiores a 4 segundos por consulta mediante la interfaz JDBC de HiveServer2.</w:t>
+        <w:t>1. **Rendimiento del Clúster Hive:** El entorno desacoplado en Docker (Hadoop 3.4.1 + Hive 4.0.1) demostró un rendimiento excelente, procesando más de 540.000 filas en consultas complejas con agrupaciones y ordenamiento en tiempos menores a 4 segundos por consulta.</w:t>
       </w:r>
     </w:p>
     <w:p>
       <w:r>
-        <w:t>2. **Impacto de la Normalización de Datos:** Se identificó que las marcas temporales en datasets de comercio electrónico deben adecuarse a los estándares ISO requeridos por los deserializadores de Hive para evitar la pérdida de dimensionalidad temporal (funciones YEAR, MONTH, HOUR y DAYOFWEEK), garantizando la exactitud de los KPIs de estacionalidad y comportamiento horario.</w:t>
+        <w:t>2. **Importancia del Tratamiento de Fechas:** Aprendí que en bases de datos analíticas como Hive es fundamental adecuar los formatos de fecha al estándar ISO (YYYY-MM-DD HH:MM:SS) durante la ingesta; de lo contrario, las funciones de fecha devuelven valores nulos y no se pueden realizar análisis temporales correctos.</w:t>
       </w:r>
     </w:p>
     <w:p>
       <w:r>
-        <w:t>3. **Valor Estratégico de los KPIs:** El análisis OLAP permitió transformar registros transaccionales brutos en decisiones estratégicas de negocio: detección de la hora pico comercial (12:00 a 14:00), confirmación de los días de mayor conversión (martes y jueves), concentración del 90% de la masa de clientes en el mercado británico y la justificación económica de programas de loyalty para convertir clientes anónimos en compradores registrados recurrentes.</w:t>
+        <w:t>3. **Decisiones Orientadas por Datos:** Los 12 KPIs analizados proporcionan respuestas concretas para la gestión de la tienda online: confirman que el Reino Unido representa el 90% de los clientes, que los días martes y jueves concentran el mayor volumen de ingresos, que la hora pico de compra es entre las 12:00 y las 14:00, y que los usuarios registrados aportan más del 80% de la facturación, justificando programas de fidelización y promociones en horarios estratégicos.</w:t>
       </w:r>
     </w:p>
     <w:p>
@@ -3105,7 +3744,7 @@
         <w:spacing w:after="80"/>
       </w:pPr>
       <w:r>
-        <w:t>• Universidad Privada del Valle. LI17 - 2.ª Práctica con Apache Hive. Guía oficial de laboratorio, 2026.</w:t>
+        <w:t>• Universidad Privada del Valle. Guía de Laboratorio LI17: 2.ª Práctica con Apache Hive, 2026.</w:t>
       </w:r>
     </w:p>
     <w:p>
@@ -3113,7 +3752,7 @@
         <w:spacing w:after="80"/>
       </w:pPr>
       <w:r>
-        <w:t>• Carrie1. E-Commerce Data (Actual transactions from UK retailer). Kaggle Datasets: https://www.kaggle.com/datasets/carrie1/ecommerce-data</w:t>
+        <w:t>• Carrie1. E-Commerce Data (Actual transactions from UK retailer). Kaggle Datasets.</w:t>
       </w:r>
     </w:p>
     <w:p>
@@ -3121,7 +3760,7 @@
         <w:spacing w:after="80"/>
       </w:pPr>
       <w:r>
-        <w:t>• Apache Hive. LanguageManual DDL &amp; Select Queries: https://cwiki.apache.org/confluence/display/Hive/LanguageManual</w:t>
+        <w:t>• Apache Hive Documentation. LanguageManual DDL and Select Statements: https://cwiki.apache.org/confluence/display/Hive/</w:t>
       </w:r>
     </w:p>
     <w:p>
@@ -3129,7 +3768,7 @@
         <w:spacing w:after="80"/>
       </w:pPr>
       <w:r>
-        <w:t>• Apache Hadoop. HDFS Architecture and MapReduce Local Execution: https://hadoop.apache.org/docs/r3.4.1/</w:t>
+        <w:t>• Apache Hadoop 3.4.1. HDFS Architecture Guide: https://hadoop.apache.org/docs/r3.4.1/</w:t>
       </w:r>
     </w:p>
     <w:p>
@@ -3137,7 +3776,7 @@
         <w:spacing w:after="80"/>
       </w:pPr>
       <w:r>
-        <w:t>• Databricks. Spark: The Definitive Guide - Retail Data Repository: https://github.com/databricks/Spark-The-Definitive-Guide</w:t>
+        <w:t>• Databricks. Online Retail Dataset Repository: https://github.com/databricks/Spark-The-Definitive-Guide</w:t>
       </w:r>
     </w:p>
     <w:sectPr>
@@ -3550,7 +4189,7 @@
     <w:qFormat/>
     <w:rsid w:val="00FC693F"/>
     <w:pPr>
-      <w:spacing w:after="160" w:line="259" w:lineRule="auto"/>
+      <w:spacing w:after="140" w:line="264" w:lineRule="auto"/>
     </w:pPr>
     <w:rPr>
       <w:rFonts w:ascii="Calibri" w:hAnsi="Calibri"/>
@@ -3619,8 +4258,8 @@
       <w:rFonts w:asciiTheme="majorHAnsi" w:eastAsiaTheme="majorEastAsia" w:hAnsiTheme="majorHAnsi" w:cstheme="majorBidi" w:ascii="Calibri" w:hAnsi="Calibri"/>
       <w:b/>
       <w:bCs/>
-      <w:color w:val="000000"/>
-      <w:sz w:val="32"/>
+      <w:color w:val="141414"/>
+      <w:sz w:val="30"/>
       <w:szCs w:val="28"/>
     </w:rPr>
   </w:style>
@@ -3643,7 +4282,7 @@
       <w:rFonts w:asciiTheme="majorHAnsi" w:eastAsiaTheme="majorEastAsia" w:hAnsiTheme="majorHAnsi" w:cstheme="majorBidi" w:ascii="Calibri" w:hAnsi="Calibri"/>
       <w:b/>
       <w:bCs/>
-      <w:color w:val="000000"/>
+      <w:color w:val="141414"/>
       <w:sz w:val="24"/>
       <w:szCs w:val="26"/>
     </w:rPr>
@@ -3664,10 +4303,11 @@
       <w:outlineLvl w:val="2"/>
     </w:pPr>
     <w:rPr>
-      <w:rFonts w:asciiTheme="majorHAnsi" w:eastAsiaTheme="majorEastAsia" w:hAnsiTheme="majorHAnsi" w:cstheme="majorBidi"/>
+      <w:rFonts w:asciiTheme="majorHAnsi" w:eastAsiaTheme="majorEastAsia" w:hAnsiTheme="majorHAnsi" w:cstheme="majorBidi" w:ascii="Calibri" w:hAnsi="Calibri"/>
       <w:b/>
       <w:bCs/>
-      <w:color w:val="4F81BD" w:themeColor="accent1"/>
+      <w:color w:val="141414"/>
+      <w:sz w:val="22"/>
     </w:rPr>
   </w:style>
   <w:style w:type="paragraph" w:styleId="Heading4">
@@ -3903,10 +4543,10 @@
     </w:pPr>
     <w:rPr>
       <w:rFonts w:asciiTheme="majorHAnsi" w:eastAsiaTheme="majorEastAsia" w:hAnsiTheme="majorHAnsi" w:cstheme="majorBidi" w:ascii="Calibri" w:hAnsi="Calibri"/>
-      <w:color w:val="000000"/>
+      <w:color w:val="141414"/>
       <w:spacing w:val="5"/>
       <w:kern w:val="28"/>
-      <w:sz w:val="56"/>
+      <w:sz w:val="52"/>
       <w:szCs w:val="52"/>
     </w:rPr>
   </w:style>

</xml_diff>